<commit_message>
feat: initialize project structure with core components, documentation, data seeds, and build automation tools
</commit_message>
<xml_diff>
--- a/deliverables/VYTAL_House_Articles_of_Organization_Draft.docx
+++ b/deliverables/VYTAL_House_Articles_of_Organization_Draft.docx
@@ -42,7 +42,7 @@
           <w:color w:val="5C626E"/>
           <w:sz w:val="19"/>
         </w:rPr>
-        <w:t>Maryland filing drafts | June 19, 2026 | Not legal advice</w:t>
+        <w:t>Maryland filing drafts | June 21, 2026 | Not legal advice</w:t>
       </w:r>
     </w:p>
     <w:p>
@@ -215,6 +215,65 @@
                 <w:sz w:val="18"/>
               </w:rPr>
               <w:t>Owner and counsel review</w:t>
+            </w:r>
+          </w:p>
+        </w:tc>
+      </w:tr>
+      <w:tr>
+        <w:tc>
+          <w:tcPr>
+            <w:tcW w:type="dxa" w:w="3312"/>
+          </w:tcPr>
+          <w:p>
+            <w:pPr>
+              <w:spacing w:after="0"/>
+            </w:pPr>
+            <w:r>
+              <w:rPr>
+                <w:rFonts w:ascii="Aptos" w:hAnsi="Aptos"/>
+                <w:b w:val="0"/>
+                <w:color w:val="22262E"/>
+                <w:sz w:val="18"/>
+              </w:rPr>
+              <w:t>Target operating location</w:t>
+            </w:r>
+          </w:p>
+        </w:tc>
+        <w:tc>
+          <w:tcPr>
+            <w:tcW w:type="dxa" w:w="3312"/>
+          </w:tcPr>
+          <w:p>
+            <w:pPr>
+              <w:spacing w:after="0"/>
+            </w:pPr>
+            <w:r>
+              <w:rPr>
+                <w:rFonts w:ascii="Aptos" w:hAnsi="Aptos"/>
+                <w:b w:val="0"/>
+                <w:color w:val="22262E"/>
+                <w:sz w:val="18"/>
+              </w:rPr>
+              <w:t>6000 Merriweather Drive, Columbia, MD 21044</w:t>
+            </w:r>
+          </w:p>
+        </w:tc>
+        <w:tc>
+          <w:tcPr>
+            <w:tcW w:type="dxa" w:w="3312"/>
+          </w:tcPr>
+          <w:p>
+            <w:pPr>
+              <w:spacing w:after="0"/>
+            </w:pPr>
+            <w:r>
+              <w:rPr>
+                <w:rFonts w:ascii="Aptos" w:hAnsi="Aptos"/>
+                <w:b w:val="0"/>
+                <w:color w:val="22262E"/>
+                <w:sz w:val="18"/>
+              </w:rPr>
+              <w:t>Lease, zoning, and counsel review</w:t>
             </w:r>
           </w:p>
         </w:tc>

</xml_diff>